<commit_message>
Cap nhat lai tai lieu tham khao
</commit_message>
<xml_diff>
--- a/Docx/Nhom3_LTM.docx
+++ b/Docx/Nhom3_LTM.docx
@@ -1,6 +1,6 @@
 
 <file path=word/document.xml><?xml version="1.0" encoding="utf-8"?>
-<w:document xmlns:wpc="http://schemas.microsoft.com/office/word/2010/wordprocessingCanvas" xmlns:cx="http://schemas.microsoft.com/office/drawing/2014/chartex" xmlns:cx1="http://schemas.microsoft.com/office/drawing/2015/9/8/chartex" xmlns:cx2="http://schemas.microsoft.com/office/drawing/2015/10/21/chartex" xmlns:cx3="http://schemas.microsoft.com/office/drawing/2016/5/9/chartex" xmlns:cx4="http://schemas.microsoft.com/office/drawing/2016/5/10/chartex" xmlns:cx5="http://schemas.microsoft.com/office/drawing/2016/5/11/chartex" xmlns:cx6="http://schemas.microsoft.com/office/drawing/2016/5/12/chartex" xmlns:cx7="http://schemas.microsoft.com/office/drawing/2016/5/13/chartex" xmlns:cx8="http://schemas.microsoft.com/office/drawing/2016/5/14/chartex" xmlns:mc="http://schemas.openxmlformats.org/markup-compatibility/2006" xmlns:aink="http://schemas.microsoft.com/office/drawing/2016/ink" xmlns:am3d="http://schemas.microsoft.com/office/drawing/2017/model3d" xmlns:o="urn:schemas-microsoft-com:office:office" xmlns:r="http://schemas.openxmlformats.org/officeDocument/2006/relationships" xmlns:m="http://schemas.openxmlformats.org/officeDocument/2006/math" xmlns:v="urn:schemas-microsoft-com:vml" xmlns:wp14="http://schemas.microsoft.com/office/word/2010/wordprocessingDrawing" xmlns:wp="http://schemas.openxmlformats.org/drawingml/2006/wordprocessingDrawing" xmlns:w10="urn:schemas-microsoft-com:office:word" xmlns:w="http://schemas.openxmlformats.org/wordprocessingml/2006/main" xmlns:w14="http://schemas.microsoft.com/office/word/2010/wordml" xmlns:w15="http://schemas.microsoft.com/office/word/2012/wordml" xmlns:w16cex="http://schemas.microsoft.com/office/word/2018/wordml/cex" xmlns:w16cid="http://schemas.microsoft.com/office/word/2016/wordml/cid" xmlns:w16="http://schemas.microsoft.com/office/word/2018/wordml" xmlns:w16sdtdh="http://schemas.microsoft.com/office/word/2020/wordml/sdtdatahash" xmlns:w16se="http://schemas.microsoft.com/office/word/2015/wordml/symex" xmlns:wpg="http://schemas.microsoft.com/office/word/2010/wordprocessingGroup" xmlns:wpi="http://schemas.microsoft.com/office/word/2010/wordprocessingInk" xmlns:wne="http://schemas.microsoft.com/office/word/2006/wordml" xmlns:wps="http://schemas.microsoft.com/office/word/2010/wordprocessingShape" mc:Ignorable="w14 w15 w16se w16cid w16 w16cex w16sdtdh wp14">
+<w:document xmlns:wpc="http://schemas.microsoft.com/office/word/2010/wordprocessingCanvas" xmlns:cx="http://schemas.microsoft.com/office/drawing/2014/chartex" xmlns:cx1="http://schemas.microsoft.com/office/drawing/2015/9/8/chartex" xmlns:cx2="http://schemas.microsoft.com/office/drawing/2015/10/21/chartex" xmlns:cx3="http://schemas.microsoft.com/office/drawing/2016/5/9/chartex" xmlns:cx4="http://schemas.microsoft.com/office/drawing/2016/5/10/chartex" xmlns:cx5="http://schemas.microsoft.com/office/drawing/2016/5/11/chartex" xmlns:cx6="http://schemas.microsoft.com/office/drawing/2016/5/12/chartex" xmlns:cx7="http://schemas.microsoft.com/office/drawing/2016/5/13/chartex" xmlns:cx8="http://schemas.microsoft.com/office/drawing/2016/5/14/chartex" xmlns:mc="http://schemas.openxmlformats.org/markup-compatibility/2006" xmlns:aink="http://schemas.microsoft.com/office/drawing/2016/ink" xmlns:am3d="http://schemas.microsoft.com/office/drawing/2017/model3d" xmlns:o="urn:schemas-microsoft-com:office:office" xmlns:r="http://schemas.openxmlformats.org/officeDocument/2006/relationships" xmlns:m="http://schemas.openxmlformats.org/officeDocument/2006/math" xmlns:v="urn:schemas-microsoft-com:vml" xmlns:wp14="http://schemas.microsoft.com/office/word/2010/wordprocessingDrawing" xmlns:wp="http://schemas.openxmlformats.org/drawingml/2006/wordprocessingDrawing" xmlns:w10="urn:schemas-microsoft-com:office:word" xmlns:w="http://schemas.openxmlformats.org/wordprocessingml/2006/main" xmlns:w14="http://schemas.microsoft.com/office/word/2010/wordml" xmlns:w15="http://schemas.microsoft.com/office/word/2012/wordml" xmlns:w16cex="http://schemas.microsoft.com/office/word/2018/wordml/cex" xmlns:w16cid="http://schemas.microsoft.com/office/word/2016/wordml/cid" xmlns:w16="http://schemas.microsoft.com/office/word/2018/wordml" xmlns:w16se="http://schemas.microsoft.com/office/word/2015/wordml/symex" xmlns:wpg="http://schemas.microsoft.com/office/word/2010/wordprocessingGroup" xmlns:wpi="http://schemas.microsoft.com/office/word/2010/wordprocessingInk" xmlns:wne="http://schemas.microsoft.com/office/word/2006/wordml" xmlns:wps="http://schemas.microsoft.com/office/word/2010/wordprocessingShape" mc:Ignorable="w14 w15 w16se w16cid w16 w16cex wp14">
   <w:body>
     <w:p>
       <w:pPr>
@@ -409,21 +409,12 @@
               <w:szCs w:val="28"/>
             </w:rPr>
           </w:pPr>
-          <w:proofErr w:type="spellStart"/>
           <w:r>
             <w:rPr>
               <w:sz w:val="28"/>
               <w:szCs w:val="28"/>
             </w:rPr>
-            <w:t>Giảng</w:t>
-          </w:r>
-          <w:proofErr w:type="spellEnd"/>
-          <w:r>
-            <w:rPr>
-              <w:sz w:val="28"/>
-              <w:szCs w:val="28"/>
-            </w:rPr>
-            <w:t xml:space="preserve"> </w:t>
+            <w:t xml:space="preserve">Giảng </w:t>
           </w:r>
           <w:proofErr w:type="spellStart"/>
           <w:r>
@@ -696,17 +687,8 @@
                     <w:b/>
                     <w:bCs/>
                   </w:rPr>
-                  <w:t xml:space="preserve">Trịnh Văn </w:t>
+                  <w:t>Trịnh Văn Thưởng</w:t>
                 </w:r>
-                <w:proofErr w:type="spellStart"/>
-                <w:r>
-                  <w:rPr>
-                    <w:b/>
-                    <w:bCs/>
-                  </w:rPr>
-                  <w:t>Thưởng</w:t>
-                </w:r>
-                <w:proofErr w:type="spellEnd"/>
               </w:p>
             </w:tc>
             <w:tc>
@@ -1625,17 +1607,8 @@
                     <w:sz w:val="26"/>
                     <w:szCs w:val="26"/>
                   </w:rPr>
-                  <w:t xml:space="preserve">Trịnh Văn </w:t>
+                  <w:t>Trịnh Văn Thưởng</w:t>
                 </w:r>
-                <w:proofErr w:type="spellStart"/>
-                <w:r>
-                  <w:rPr>
-                    <w:sz w:val="26"/>
-                    <w:szCs w:val="26"/>
-                  </w:rPr>
-                  <w:t>Thưởng</w:t>
-                </w:r>
-                <w:proofErr w:type="spellEnd"/>
               </w:p>
             </w:tc>
             <w:tc>
@@ -1856,13 +1829,7 @@
                 </w:r>
                 <w:proofErr w:type="spellEnd"/>
                 <w:r>
-                  <w:t xml:space="preserve"> </w:t>
-                </w:r>
-                <w:r>
-                  <w:t xml:space="preserve"> </w:t>
-                </w:r>
-                <w:r>
-                  <w:t>client_display.py</w:t>
+                  <w:t xml:space="preserve">  client_display.py</w:t>
                 </w:r>
                 <w:proofErr w:type="gramEnd"/>
                 <w:r>
@@ -3606,6 +3573,12 @@
     </w:p>
     <w:sdt>
       <w:sdtPr>
+        <w:rPr>
+          <w:rFonts w:ascii="Times New Roman" w:eastAsiaTheme="minorHAnsi" w:hAnsi="Times New Roman" w:cstheme="minorBidi"/>
+          <w:color w:val="auto"/>
+          <w:sz w:val="28"/>
+          <w:szCs w:val="28"/>
+        </w:rPr>
         <w:id w:val="2007783720"/>
         <w:docPartObj>
           <w:docPartGallery w:val="Table of Contents"/>
@@ -3614,13 +3587,9 @@
       </w:sdtPr>
       <w:sdtEndPr>
         <w:rPr>
-          <w:rFonts w:ascii="Times New Roman" w:eastAsiaTheme="minorHAnsi" w:hAnsi="Times New Roman" w:cstheme="minorBidi"/>
           <w:b/>
           <w:bCs/>
           <w:noProof/>
-          <w:color w:val="auto"/>
-          <w:sz w:val="28"/>
-          <w:szCs w:val="28"/>
         </w:rPr>
       </w:sdtEndPr>
       <w:sdtContent>
@@ -12580,12 +12549,21 @@
           <w:szCs w:val="26"/>
         </w:rPr>
       </w:pPr>
-      <w:r>
-        <w:rPr>
-          <w:sz w:val="26"/>
-          <w:szCs w:val="26"/>
-        </w:rPr>
-        <w:t xml:space="preserve">Kiểm </w:t>
+      <w:proofErr w:type="spellStart"/>
+      <w:r>
+        <w:rPr>
+          <w:sz w:val="26"/>
+          <w:szCs w:val="26"/>
+        </w:rPr>
+        <w:t>Kiểm</w:t>
+      </w:r>
+      <w:proofErr w:type="spellEnd"/>
+      <w:r>
+        <w:rPr>
+          <w:sz w:val="26"/>
+          <w:szCs w:val="26"/>
+        </w:rPr>
+        <w:t xml:space="preserve"> </w:t>
       </w:r>
       <w:proofErr w:type="spellStart"/>
       <w:r>
@@ -14129,8 +14107,13 @@
           <w:numId w:val="5"/>
         </w:numPr>
       </w:pPr>
-      <w:r>
-        <w:t xml:space="preserve">Mạng </w:t>
+      <w:proofErr w:type="spellStart"/>
+      <w:r>
+        <w:t>Mạng</w:t>
+      </w:r>
+      <w:proofErr w:type="spellEnd"/>
+      <w:r>
+        <w:t xml:space="preserve"> </w:t>
       </w:r>
       <w:proofErr w:type="spellStart"/>
       <w:r>
@@ -15038,23 +15021,13 @@
           <w:szCs w:val="26"/>
         </w:rPr>
       </w:pPr>
-      <w:proofErr w:type="spellStart"/>
-      <w:r>
-        <w:rPr>
-          <w:rFonts w:cs="Times New Roman"/>
-          <w:sz w:val="26"/>
-          <w:szCs w:val="26"/>
-        </w:rPr>
-        <w:t>Tìm</w:t>
-      </w:r>
-      <w:proofErr w:type="spellEnd"/>
-      <w:r>
-        <w:rPr>
-          <w:rFonts w:cs="Times New Roman"/>
-          <w:sz w:val="26"/>
-          <w:szCs w:val="26"/>
-        </w:rPr>
-        <w:t xml:space="preserve"> </w:t>
+      <w:r>
+        <w:rPr>
+          <w:rFonts w:cs="Times New Roman"/>
+          <w:sz w:val="26"/>
+          <w:szCs w:val="26"/>
+        </w:rPr>
+        <w:t xml:space="preserve">Tìm </w:t>
       </w:r>
       <w:proofErr w:type="spellStart"/>
       <w:r>
@@ -15214,23 +15187,13 @@
           <w:szCs w:val="26"/>
         </w:rPr>
       </w:pPr>
-      <w:proofErr w:type="spellStart"/>
-      <w:r>
-        <w:rPr>
-          <w:rFonts w:cs="Times New Roman"/>
-          <w:sz w:val="26"/>
-          <w:szCs w:val="26"/>
-        </w:rPr>
-        <w:t>Tìm</w:t>
-      </w:r>
-      <w:proofErr w:type="spellEnd"/>
-      <w:r>
-        <w:rPr>
-          <w:rFonts w:cs="Times New Roman"/>
-          <w:sz w:val="26"/>
-          <w:szCs w:val="26"/>
-        </w:rPr>
-        <w:t xml:space="preserve"> </w:t>
+      <w:r>
+        <w:rPr>
+          <w:rFonts w:cs="Times New Roman"/>
+          <w:sz w:val="26"/>
+          <w:szCs w:val="26"/>
+        </w:rPr>
+        <w:t xml:space="preserve">Tìm </w:t>
       </w:r>
       <w:proofErr w:type="spellStart"/>
       <w:r>
@@ -16336,7 +16299,29 @@
           <w:sz w:val="26"/>
           <w:szCs w:val="26"/>
         </w:rPr>
-        <w:t xml:space="preserve"> Kiểm </w:t>
+        <w:t xml:space="preserve"> </w:t>
+      </w:r>
+      <w:proofErr w:type="spellStart"/>
+      <w:r>
+        <w:rPr>
+          <w:rFonts w:cs="Times New Roman"/>
+          <w:b/>
+          <w:bCs/>
+          <w:sz w:val="26"/>
+          <w:szCs w:val="26"/>
+        </w:rPr>
+        <w:t>Kiểm</w:t>
+      </w:r>
+      <w:proofErr w:type="spellEnd"/>
+      <w:r>
+        <w:rPr>
+          <w:rFonts w:cs="Times New Roman"/>
+          <w:b/>
+          <w:bCs/>
+          <w:sz w:val="26"/>
+          <w:szCs w:val="26"/>
+        </w:rPr>
+        <w:t xml:space="preserve"> </w:t>
       </w:r>
       <w:proofErr w:type="spellStart"/>
       <w:r>
@@ -16492,13 +16477,23 @@
           <w:szCs w:val="26"/>
         </w:rPr>
       </w:pPr>
-      <w:r>
-        <w:rPr>
-          <w:rFonts w:cs="Times New Roman"/>
-          <w:sz w:val="26"/>
-          <w:szCs w:val="26"/>
-        </w:rPr>
-        <w:t xml:space="preserve">Kiểm </w:t>
+      <w:proofErr w:type="spellStart"/>
+      <w:r>
+        <w:rPr>
+          <w:rFonts w:cs="Times New Roman"/>
+          <w:sz w:val="26"/>
+          <w:szCs w:val="26"/>
+        </w:rPr>
+        <w:t>Kiểm</w:t>
+      </w:r>
+      <w:proofErr w:type="spellEnd"/>
+      <w:r>
+        <w:rPr>
+          <w:rFonts w:cs="Times New Roman"/>
+          <w:sz w:val="26"/>
+          <w:szCs w:val="26"/>
+        </w:rPr>
+        <w:t xml:space="preserve"> </w:t>
       </w:r>
       <w:proofErr w:type="spellStart"/>
       <w:r>
@@ -23648,8 +23643,8 @@
         </w:rPr>
       </w:pPr>
       <w:bookmarkStart w:id="23" w:name="_Toc218546946"/>
-      <w:bookmarkStart w:id="24" w:name="_Toc218546945"/>
-      <w:bookmarkStart w:id="25" w:name="_Toc226964888"/>
+      <w:bookmarkStart w:id="24" w:name="_Toc226964888"/>
+      <w:bookmarkStart w:id="25" w:name="_Toc218546945"/>
       <w:r>
         <w:rPr>
           <w:rFonts w:cs="Times New Roman"/>
@@ -23689,7 +23684,7 @@
         <w:t xml:space="preserve"> TCP</w:t>
       </w:r>
       <w:bookmarkEnd w:id="23"/>
-      <w:bookmarkEnd w:id="25"/>
+      <w:bookmarkEnd w:id="24"/>
     </w:p>
     <w:p>
       <w:pPr>
@@ -27024,9 +27019,9 @@
         </w:rPr>
       </w:pPr>
       <w:bookmarkStart w:id="28" w:name="_Toc218546950"/>
-      <w:bookmarkStart w:id="29" w:name="_Toc218546947"/>
-      <w:bookmarkStart w:id="30" w:name="_Toc226964889"/>
-      <w:bookmarkEnd w:id="24"/>
+      <w:bookmarkStart w:id="29" w:name="_Toc226964889"/>
+      <w:bookmarkStart w:id="30" w:name="_Toc218546947"/>
+      <w:bookmarkEnd w:id="25"/>
       <w:r>
         <w:rPr>
           <w:rFonts w:cs="Times New Roman"/>
@@ -27075,7 +27070,7 @@
         <w:t>dụng</w:t>
       </w:r>
       <w:bookmarkEnd w:id="28"/>
-      <w:bookmarkEnd w:id="30"/>
+      <w:bookmarkEnd w:id="29"/>
       <w:proofErr w:type="spellEnd"/>
     </w:p>
     <w:p>
@@ -28692,25 +28687,51 @@
       <w:r>
         <w:t xml:space="preserve"> </w:t>
       </w:r>
-      <w:fldSimple w:instr=" STYLEREF 1 \s ">
-        <w:r>
-          <w:rPr>
-            <w:noProof/>
-          </w:rPr>
-          <w:t>2</w:t>
-        </w:r>
-      </w:fldSimple>
+      <w:r>
+        <w:fldChar w:fldCharType="begin"/>
+      </w:r>
+      <w:r>
+        <w:instrText xml:space="preserve"> STYLEREF 1 \s </w:instrText>
+      </w:r>
+      <w:r>
+        <w:fldChar w:fldCharType="separate"/>
+      </w:r>
+      <w:r>
+        <w:rPr>
+          <w:noProof/>
+        </w:rPr>
+        <w:t>2</w:t>
+      </w:r>
+      <w:r>
+        <w:rPr>
+          <w:noProof/>
+        </w:rPr>
+        <w:fldChar w:fldCharType="end"/>
+      </w:r>
       <w:r>
         <w:t>.</w:t>
       </w:r>
-      <w:fldSimple w:instr=" SEQ Hình_ \* ARABIC \s 1 ">
-        <w:r>
-          <w:rPr>
-            <w:noProof/>
-          </w:rPr>
-          <w:t>6</w:t>
-        </w:r>
-      </w:fldSimple>
+      <w:r>
+        <w:fldChar w:fldCharType="begin"/>
+      </w:r>
+      <w:r>
+        <w:instrText xml:space="preserve"> SEQ Hình_ \* ARABIC \s 1 </w:instrText>
+      </w:r>
+      <w:r>
+        <w:fldChar w:fldCharType="separate"/>
+      </w:r>
+      <w:r>
+        <w:rPr>
+          <w:noProof/>
+        </w:rPr>
+        <w:t>6</w:t>
+      </w:r>
+      <w:r>
+        <w:rPr>
+          <w:noProof/>
+        </w:rPr>
+        <w:fldChar w:fldCharType="end"/>
+      </w:r>
       <w:r>
         <w:t>. Python</w:t>
       </w:r>
@@ -28735,7 +28756,7 @@
         </w:rPr>
         <w:t>.</w:t>
       </w:r>
-      <w:bookmarkEnd w:id="29"/>
+      <w:bookmarkEnd w:id="30"/>
       <w:bookmarkEnd w:id="34"/>
     </w:p>
     <w:p>
@@ -29644,8 +29665,8 @@
       <w:pPr>
         <w:pStyle w:val="Heading2"/>
       </w:pPr>
-      <w:bookmarkStart w:id="38" w:name="_Toc218546957"/>
-      <w:bookmarkStart w:id="39" w:name="_Toc226964894"/>
+      <w:bookmarkStart w:id="38" w:name="_Toc226964894"/>
+      <w:bookmarkStart w:id="39" w:name="_Toc218546957"/>
       <w:proofErr w:type="spellStart"/>
       <w:r>
         <w:t>Ứng</w:t>
@@ -29682,7 +29703,7 @@
       <w:r>
         <w:t>tế</w:t>
       </w:r>
-      <w:bookmarkEnd w:id="39"/>
+      <w:bookmarkEnd w:id="38"/>
       <w:proofErr w:type="spellEnd"/>
     </w:p>
     <w:p>
@@ -29910,15 +29931,15 @@
         </w:rPr>
         <w:t>PHÂN TÍCH VÀ THIẾT KẾ HỆ THỐNG</w:t>
       </w:r>
-      <w:bookmarkEnd w:id="38"/>
+      <w:bookmarkEnd w:id="39"/>
       <w:bookmarkEnd w:id="40"/>
     </w:p>
     <w:p>
       <w:pPr>
         <w:pStyle w:val="Heading2"/>
       </w:pPr>
-      <w:bookmarkStart w:id="41" w:name="_Toc218546960"/>
-      <w:bookmarkStart w:id="42" w:name="_Toc226964896"/>
+      <w:bookmarkStart w:id="41" w:name="_Toc226964896"/>
+      <w:bookmarkStart w:id="42" w:name="_Toc218546960"/>
       <w:proofErr w:type="spellStart"/>
       <w:r>
         <w:rPr>
@@ -30018,7 +30039,7 @@
         </w:rPr>
         <w:t>thống</w:t>
       </w:r>
-      <w:bookmarkEnd w:id="42"/>
+      <w:bookmarkEnd w:id="41"/>
       <w:proofErr w:type="spellEnd"/>
     </w:p>
     <w:p>
@@ -31382,7 +31403,7 @@
         </w:rPr>
       </w:pPr>
       <w:bookmarkStart w:id="52" w:name="_Toc226964906"/>
-      <w:bookmarkEnd w:id="41"/>
+      <w:bookmarkEnd w:id="42"/>
       <w:r>
         <w:t>XÂY DỰNG VÀ TRIỂN KHAI</w:t>
       </w:r>
@@ -31392,8 +31413,8 @@
       <w:pPr>
         <w:pStyle w:val="Heading2"/>
       </w:pPr>
-      <w:bookmarkStart w:id="53" w:name="_Toc218546965"/>
-      <w:bookmarkStart w:id="54" w:name="_Toc226964907"/>
+      <w:bookmarkStart w:id="53" w:name="_Toc226964907"/>
+      <w:bookmarkStart w:id="54" w:name="_Toc218546965"/>
       <w:r>
         <w:rPr>
           <w:rStyle w:val="Strong"/>
@@ -31447,7 +31468,7 @@
         </w:rPr>
         <w:t>dụng</w:t>
       </w:r>
-      <w:bookmarkEnd w:id="54"/>
+      <w:bookmarkEnd w:id="53"/>
       <w:proofErr w:type="spellEnd"/>
     </w:p>
     <w:p>
@@ -40704,9 +40725,9 @@
       <w:pPr>
         <w:pStyle w:val="Heading2"/>
       </w:pPr>
-      <w:bookmarkStart w:id="63" w:name="_Toc218546971"/>
-      <w:bookmarkStart w:id="64" w:name="_Toc226964916"/>
-      <w:bookmarkEnd w:id="53"/>
+      <w:bookmarkStart w:id="63" w:name="_Toc226964916"/>
+      <w:bookmarkStart w:id="64" w:name="_Toc218546971"/>
+      <w:bookmarkEnd w:id="54"/>
       <w:proofErr w:type="spellStart"/>
       <w:r>
         <w:rPr>
@@ -40788,7 +40809,7 @@
         </w:rPr>
         <w:t>tài</w:t>
       </w:r>
-      <w:bookmarkEnd w:id="64"/>
+      <w:bookmarkEnd w:id="63"/>
       <w:proofErr w:type="spellEnd"/>
     </w:p>
     <w:p>
@@ -43338,55 +43359,41 @@
         </w:rPr>
         <w:t>TÀI LIỆU THAM KHẢO</w:t>
       </w:r>
-      <w:bookmarkEnd w:id="63"/>
+      <w:bookmarkEnd w:id="64"/>
       <w:bookmarkEnd w:id="68"/>
     </w:p>
     <w:p>
       <w:pPr>
         <w:pStyle w:val="NormalWeb"/>
-        <w:spacing w:before="0" w:beforeAutospacing="0" w:after="0" w:afterAutospacing="0" w:line="360" w:lineRule="auto"/>
+        <w:spacing w:line="360" w:lineRule="auto"/>
         <w:ind w:firstLine="284"/>
+        <w:rPr>
+          <w:i/>
+          <w:iCs/>
+          <w:sz w:val="26"/>
+          <w:szCs w:val="26"/>
+        </w:rPr>
+      </w:pPr>
+      <w:r>
         <w:rPr>
           <w:sz w:val="28"/>
           <w:szCs w:val="28"/>
         </w:rPr>
-      </w:pPr>
+        <w:t>[1]</w:t>
+      </w:r>
       <w:r>
         <w:rPr>
           <w:sz w:val="28"/>
           <w:szCs w:val="28"/>
         </w:rPr>
-        <w:t>[1]</w:t>
-      </w:r>
-      <w:r>
-        <w:rPr>
-          <w:sz w:val="28"/>
-          <w:szCs w:val="28"/>
-        </w:rPr>
-        <w:t xml:space="preserve"> </w:t>
-      </w:r>
-      <w:r>
-        <w:rPr>
-          <w:sz w:val="26"/>
-          <w:szCs w:val="26"/>
-        </w:rPr>
-        <w:t xml:space="preserve">A. </w:t>
-      </w:r>
-      <w:proofErr w:type="spellStart"/>
-      <w:r>
-        <w:rPr>
-          <w:sz w:val="26"/>
-          <w:szCs w:val="26"/>
-        </w:rPr>
-        <w:t>Calcatinge</w:t>
-      </w:r>
-      <w:proofErr w:type="spellEnd"/>
-      <w:r>
-        <w:rPr>
-          <w:sz w:val="26"/>
-          <w:szCs w:val="26"/>
-        </w:rPr>
-        <w:t>, J. Balog</w:t>
+        <w:t xml:space="preserve"> </w:t>
+      </w:r>
+      <w:r>
+        <w:rPr>
+          <w:sz w:val="26"/>
+          <w:szCs w:val="26"/>
+        </w:rPr>
+        <w:t>Douglas E. Comer</w:t>
       </w:r>
       <w:r>
         <w:rPr>
@@ -43416,7 +43423,25 @@
           <w:sz w:val="26"/>
           <w:szCs w:val="26"/>
         </w:rPr>
-        <w:t>Mastering Linux Administration: Take your sysadmin skills to the next level by configuring and maintaining Linux systems</w:t>
+        <w:t>Internetworking with TCP/IP Volume One 6th Edition, Kindle Edition</w:t>
+      </w:r>
+      <w:r>
+        <w:rPr>
+          <w:i/>
+          <w:iCs/>
+          <w:sz w:val="26"/>
+          <w:szCs w:val="26"/>
+        </w:rPr>
+        <w:t xml:space="preserve"> </w:t>
+      </w:r>
+      <w:r>
+        <w:rPr>
+          <w:i/>
+          <w:iCs/>
+          <w:sz w:val="26"/>
+          <w:szCs w:val="26"/>
+        </w:rPr>
+        <w:t>by Douglas Comer</w:t>
       </w:r>
       <w:r>
         <w:rPr>
@@ -43431,7 +43456,21 @@
           <w:sz w:val="26"/>
           <w:szCs w:val="26"/>
         </w:rPr>
-        <w:t>, 2024.</w:t>
+        <w:t>, 20</w:t>
+      </w:r>
+      <w:r>
+        <w:rPr>
+          <w:sz w:val="26"/>
+          <w:szCs w:val="26"/>
+        </w:rPr>
+        <w:t>13</w:t>
+      </w:r>
+      <w:r>
+        <w:rPr>
+          <w:sz w:val="26"/>
+          <w:szCs w:val="26"/>
+        </w:rPr>
+        <w:t>.</w:t>
       </w:r>
     </w:p>
     <w:p>
@@ -43598,7 +43637,7 @@
 </file>
 
 <file path=word/endnotes.xml><?xml version="1.0" encoding="utf-8"?>
-<w:endnotes xmlns:wpc="http://schemas.microsoft.com/office/word/2010/wordprocessingCanvas" xmlns:cx="http://schemas.microsoft.com/office/drawing/2014/chartex" xmlns:cx1="http://schemas.microsoft.com/office/drawing/2015/9/8/chartex" xmlns:cx2="http://schemas.microsoft.com/office/drawing/2015/10/21/chartex" xmlns:cx3="http://schemas.microsoft.com/office/drawing/2016/5/9/chartex" xmlns:cx4="http://schemas.microsoft.com/office/drawing/2016/5/10/chartex" xmlns:cx5="http://schemas.microsoft.com/office/drawing/2016/5/11/chartex" xmlns:cx6="http://schemas.microsoft.com/office/drawing/2016/5/12/chartex" xmlns:cx7="http://schemas.microsoft.com/office/drawing/2016/5/13/chartex" xmlns:cx8="http://schemas.microsoft.com/office/drawing/2016/5/14/chartex" xmlns:mc="http://schemas.openxmlformats.org/markup-compatibility/2006" xmlns:aink="http://schemas.microsoft.com/office/drawing/2016/ink" xmlns:am3d="http://schemas.microsoft.com/office/drawing/2017/model3d" xmlns:o="urn:schemas-microsoft-com:office:office" xmlns:r="http://schemas.openxmlformats.org/officeDocument/2006/relationships" xmlns:m="http://schemas.openxmlformats.org/officeDocument/2006/math" xmlns:v="urn:schemas-microsoft-com:vml" xmlns:wp14="http://schemas.microsoft.com/office/word/2010/wordprocessingDrawing" xmlns:wp="http://schemas.openxmlformats.org/drawingml/2006/wordprocessingDrawing" xmlns:w10="urn:schemas-microsoft-com:office:word" xmlns:w="http://schemas.openxmlformats.org/wordprocessingml/2006/main" xmlns:w14="http://schemas.microsoft.com/office/word/2010/wordml" xmlns:w15="http://schemas.microsoft.com/office/word/2012/wordml" xmlns:w16cex="http://schemas.microsoft.com/office/word/2018/wordml/cex" xmlns:w16cid="http://schemas.microsoft.com/office/word/2016/wordml/cid" xmlns:w16="http://schemas.microsoft.com/office/word/2018/wordml" xmlns:w16sdtdh="http://schemas.microsoft.com/office/word/2020/wordml/sdtdatahash" xmlns:w16se="http://schemas.microsoft.com/office/word/2015/wordml/symex" xmlns:wpg="http://schemas.microsoft.com/office/word/2010/wordprocessingGroup" xmlns:wpi="http://schemas.microsoft.com/office/word/2010/wordprocessingInk" xmlns:wne="http://schemas.microsoft.com/office/word/2006/wordml" xmlns:wps="http://schemas.microsoft.com/office/word/2010/wordprocessingShape" mc:Ignorable="w14 w15 w16se w16cid w16 w16cex w16sdtdh wp14">
+<w:endnotes xmlns:wpc="http://schemas.microsoft.com/office/word/2010/wordprocessingCanvas" xmlns:cx="http://schemas.microsoft.com/office/drawing/2014/chartex" xmlns:cx1="http://schemas.microsoft.com/office/drawing/2015/9/8/chartex" xmlns:cx2="http://schemas.microsoft.com/office/drawing/2015/10/21/chartex" xmlns:cx3="http://schemas.microsoft.com/office/drawing/2016/5/9/chartex" xmlns:cx4="http://schemas.microsoft.com/office/drawing/2016/5/10/chartex" xmlns:cx5="http://schemas.microsoft.com/office/drawing/2016/5/11/chartex" xmlns:cx6="http://schemas.microsoft.com/office/drawing/2016/5/12/chartex" xmlns:cx7="http://schemas.microsoft.com/office/drawing/2016/5/13/chartex" xmlns:cx8="http://schemas.microsoft.com/office/drawing/2016/5/14/chartex" xmlns:mc="http://schemas.openxmlformats.org/markup-compatibility/2006" xmlns:aink="http://schemas.microsoft.com/office/drawing/2016/ink" xmlns:am3d="http://schemas.microsoft.com/office/drawing/2017/model3d" xmlns:o="urn:schemas-microsoft-com:office:office" xmlns:r="http://schemas.openxmlformats.org/officeDocument/2006/relationships" xmlns:m="http://schemas.openxmlformats.org/officeDocument/2006/math" xmlns:v="urn:schemas-microsoft-com:vml" xmlns:wp14="http://schemas.microsoft.com/office/word/2010/wordprocessingDrawing" xmlns:wp="http://schemas.openxmlformats.org/drawingml/2006/wordprocessingDrawing" xmlns:w10="urn:schemas-microsoft-com:office:word" xmlns:w="http://schemas.openxmlformats.org/wordprocessingml/2006/main" xmlns:w14="http://schemas.microsoft.com/office/word/2010/wordml" xmlns:w15="http://schemas.microsoft.com/office/word/2012/wordml" xmlns:w16cex="http://schemas.microsoft.com/office/word/2018/wordml/cex" xmlns:w16cid="http://schemas.microsoft.com/office/word/2016/wordml/cid" xmlns:w16="http://schemas.microsoft.com/office/word/2018/wordml" xmlns:w16se="http://schemas.microsoft.com/office/word/2015/wordml/symex" xmlns:wpg="http://schemas.microsoft.com/office/word/2010/wordprocessingGroup" xmlns:wpi="http://schemas.microsoft.com/office/word/2010/wordprocessingInk" xmlns:wne="http://schemas.microsoft.com/office/word/2006/wordml" xmlns:wps="http://schemas.microsoft.com/office/word/2010/wordprocessingShape" mc:Ignorable="w14 w15 w16se w16cid w16 w16cex wp14">
   <w:endnote w:type="separator" w:id="-1">
     <w:p>
       <w:pPr>
@@ -43623,7 +43662,7 @@
 </file>
 
 <file path=word/footer1.xml><?xml version="1.0" encoding="utf-8"?>
-<w:ftr xmlns:wpc="http://schemas.microsoft.com/office/word/2010/wordprocessingCanvas" xmlns:cx="http://schemas.microsoft.com/office/drawing/2014/chartex" xmlns:cx1="http://schemas.microsoft.com/office/drawing/2015/9/8/chartex" xmlns:cx2="http://schemas.microsoft.com/office/drawing/2015/10/21/chartex" xmlns:cx3="http://schemas.microsoft.com/office/drawing/2016/5/9/chartex" xmlns:cx4="http://schemas.microsoft.com/office/drawing/2016/5/10/chartex" xmlns:cx5="http://schemas.microsoft.com/office/drawing/2016/5/11/chartex" xmlns:cx6="http://schemas.microsoft.com/office/drawing/2016/5/12/chartex" xmlns:cx7="http://schemas.microsoft.com/office/drawing/2016/5/13/chartex" xmlns:cx8="http://schemas.microsoft.com/office/drawing/2016/5/14/chartex" xmlns:mc="http://schemas.openxmlformats.org/markup-compatibility/2006" xmlns:aink="http://schemas.microsoft.com/office/drawing/2016/ink" xmlns:am3d="http://schemas.microsoft.com/office/drawing/2017/model3d" xmlns:o="urn:schemas-microsoft-com:office:office" xmlns:r="http://schemas.openxmlformats.org/officeDocument/2006/relationships" xmlns:m="http://schemas.openxmlformats.org/officeDocument/2006/math" xmlns:v="urn:schemas-microsoft-com:vml" xmlns:wp14="http://schemas.microsoft.com/office/word/2010/wordprocessingDrawing" xmlns:wp="http://schemas.openxmlformats.org/drawingml/2006/wordprocessingDrawing" xmlns:w10="urn:schemas-microsoft-com:office:word" xmlns:w="http://schemas.openxmlformats.org/wordprocessingml/2006/main" xmlns:w14="http://schemas.microsoft.com/office/word/2010/wordml" xmlns:w15="http://schemas.microsoft.com/office/word/2012/wordml" xmlns:w16cex="http://schemas.microsoft.com/office/word/2018/wordml/cex" xmlns:w16cid="http://schemas.microsoft.com/office/word/2016/wordml/cid" xmlns:w16="http://schemas.microsoft.com/office/word/2018/wordml" xmlns:w16sdtdh="http://schemas.microsoft.com/office/word/2020/wordml/sdtdatahash" xmlns:w16se="http://schemas.microsoft.com/office/word/2015/wordml/symex" xmlns:wpg="http://schemas.microsoft.com/office/word/2010/wordprocessingGroup" xmlns:wpi="http://schemas.microsoft.com/office/word/2010/wordprocessingInk" xmlns:wne="http://schemas.microsoft.com/office/word/2006/wordml" xmlns:wps="http://schemas.microsoft.com/office/word/2010/wordprocessingShape" mc:Ignorable="w14 w15 w16se w16cid w16 w16cex w16sdtdh wp14">
+<w:ftr xmlns:wpc="http://schemas.microsoft.com/office/word/2010/wordprocessingCanvas" xmlns:cx="http://schemas.microsoft.com/office/drawing/2014/chartex" xmlns:cx1="http://schemas.microsoft.com/office/drawing/2015/9/8/chartex" xmlns:cx2="http://schemas.microsoft.com/office/drawing/2015/10/21/chartex" xmlns:cx3="http://schemas.microsoft.com/office/drawing/2016/5/9/chartex" xmlns:cx4="http://schemas.microsoft.com/office/drawing/2016/5/10/chartex" xmlns:cx5="http://schemas.microsoft.com/office/drawing/2016/5/11/chartex" xmlns:cx6="http://schemas.microsoft.com/office/drawing/2016/5/12/chartex" xmlns:cx7="http://schemas.microsoft.com/office/drawing/2016/5/13/chartex" xmlns:cx8="http://schemas.microsoft.com/office/drawing/2016/5/14/chartex" xmlns:mc="http://schemas.openxmlformats.org/markup-compatibility/2006" xmlns:aink="http://schemas.microsoft.com/office/drawing/2016/ink" xmlns:am3d="http://schemas.microsoft.com/office/drawing/2017/model3d" xmlns:o="urn:schemas-microsoft-com:office:office" xmlns:r="http://schemas.openxmlformats.org/officeDocument/2006/relationships" xmlns:m="http://schemas.openxmlformats.org/officeDocument/2006/math" xmlns:v="urn:schemas-microsoft-com:vml" xmlns:wp14="http://schemas.microsoft.com/office/word/2010/wordprocessingDrawing" xmlns:wp="http://schemas.openxmlformats.org/drawingml/2006/wordprocessingDrawing" xmlns:w10="urn:schemas-microsoft-com:office:word" xmlns:w="http://schemas.openxmlformats.org/wordprocessingml/2006/main" xmlns:w14="http://schemas.microsoft.com/office/word/2010/wordml" xmlns:w15="http://schemas.microsoft.com/office/word/2012/wordml" xmlns:w16cex="http://schemas.microsoft.com/office/word/2018/wordml/cex" xmlns:w16cid="http://schemas.microsoft.com/office/word/2016/wordml/cid" xmlns:w16="http://schemas.microsoft.com/office/word/2018/wordml" xmlns:w16se="http://schemas.microsoft.com/office/word/2015/wordml/symex" xmlns:wpg="http://schemas.microsoft.com/office/word/2010/wordprocessingGroup" xmlns:wpi="http://schemas.microsoft.com/office/word/2010/wordprocessingInk" xmlns:wne="http://schemas.microsoft.com/office/word/2006/wordml" xmlns:wps="http://schemas.microsoft.com/office/word/2010/wordprocessingShape" mc:Ignorable="w14 w15 w16se w16cid w16 w16cex wp14">
   <w:sdt>
     <w:sdtPr>
       <w:id w:val="1668904540"/>
@@ -43677,7 +43716,7 @@
 </file>
 
 <file path=word/footnotes.xml><?xml version="1.0" encoding="utf-8"?>
-<w:footnotes xmlns:wpc="http://schemas.microsoft.com/office/word/2010/wordprocessingCanvas" xmlns:cx="http://schemas.microsoft.com/office/drawing/2014/chartex" xmlns:cx1="http://schemas.microsoft.com/office/drawing/2015/9/8/chartex" xmlns:cx2="http://schemas.microsoft.com/office/drawing/2015/10/21/chartex" xmlns:cx3="http://schemas.microsoft.com/office/drawing/2016/5/9/chartex" xmlns:cx4="http://schemas.microsoft.com/office/drawing/2016/5/10/chartex" xmlns:cx5="http://schemas.microsoft.com/office/drawing/2016/5/11/chartex" xmlns:cx6="http://schemas.microsoft.com/office/drawing/2016/5/12/chartex" xmlns:cx7="http://schemas.microsoft.com/office/drawing/2016/5/13/chartex" xmlns:cx8="http://schemas.microsoft.com/office/drawing/2016/5/14/chartex" xmlns:mc="http://schemas.openxmlformats.org/markup-compatibility/2006" xmlns:aink="http://schemas.microsoft.com/office/drawing/2016/ink" xmlns:am3d="http://schemas.microsoft.com/office/drawing/2017/model3d" xmlns:o="urn:schemas-microsoft-com:office:office" xmlns:r="http://schemas.openxmlformats.org/officeDocument/2006/relationships" xmlns:m="http://schemas.openxmlformats.org/officeDocument/2006/math" xmlns:v="urn:schemas-microsoft-com:vml" xmlns:wp14="http://schemas.microsoft.com/office/word/2010/wordprocessingDrawing" xmlns:wp="http://schemas.openxmlformats.org/drawingml/2006/wordprocessingDrawing" xmlns:w10="urn:schemas-microsoft-com:office:word" xmlns:w="http://schemas.openxmlformats.org/wordprocessingml/2006/main" xmlns:w14="http://schemas.microsoft.com/office/word/2010/wordml" xmlns:w15="http://schemas.microsoft.com/office/word/2012/wordml" xmlns:w16cex="http://schemas.microsoft.com/office/word/2018/wordml/cex" xmlns:w16cid="http://schemas.microsoft.com/office/word/2016/wordml/cid" xmlns:w16="http://schemas.microsoft.com/office/word/2018/wordml" xmlns:w16sdtdh="http://schemas.microsoft.com/office/word/2020/wordml/sdtdatahash" xmlns:w16se="http://schemas.microsoft.com/office/word/2015/wordml/symex" xmlns:wpg="http://schemas.microsoft.com/office/word/2010/wordprocessingGroup" xmlns:wpi="http://schemas.microsoft.com/office/word/2010/wordprocessingInk" xmlns:wne="http://schemas.microsoft.com/office/word/2006/wordml" xmlns:wps="http://schemas.microsoft.com/office/word/2010/wordprocessingShape" mc:Ignorable="w14 w15 w16se w16cid w16 w16cex w16sdtdh wp14">
+<w:footnotes xmlns:wpc="http://schemas.microsoft.com/office/word/2010/wordprocessingCanvas" xmlns:cx="http://schemas.microsoft.com/office/drawing/2014/chartex" xmlns:cx1="http://schemas.microsoft.com/office/drawing/2015/9/8/chartex" xmlns:cx2="http://schemas.microsoft.com/office/drawing/2015/10/21/chartex" xmlns:cx3="http://schemas.microsoft.com/office/drawing/2016/5/9/chartex" xmlns:cx4="http://schemas.microsoft.com/office/drawing/2016/5/10/chartex" xmlns:cx5="http://schemas.microsoft.com/office/drawing/2016/5/11/chartex" xmlns:cx6="http://schemas.microsoft.com/office/drawing/2016/5/12/chartex" xmlns:cx7="http://schemas.microsoft.com/office/drawing/2016/5/13/chartex" xmlns:cx8="http://schemas.microsoft.com/office/drawing/2016/5/14/chartex" xmlns:mc="http://schemas.openxmlformats.org/markup-compatibility/2006" xmlns:aink="http://schemas.microsoft.com/office/drawing/2016/ink" xmlns:am3d="http://schemas.microsoft.com/office/drawing/2017/model3d" xmlns:o="urn:schemas-microsoft-com:office:office" xmlns:r="http://schemas.openxmlformats.org/officeDocument/2006/relationships" xmlns:m="http://schemas.openxmlformats.org/officeDocument/2006/math" xmlns:v="urn:schemas-microsoft-com:vml" xmlns:wp14="http://schemas.microsoft.com/office/word/2010/wordprocessingDrawing" xmlns:wp="http://schemas.openxmlformats.org/drawingml/2006/wordprocessingDrawing" xmlns:w10="urn:schemas-microsoft-com:office:word" xmlns:w="http://schemas.openxmlformats.org/wordprocessingml/2006/main" xmlns:w14="http://schemas.microsoft.com/office/word/2010/wordml" xmlns:w15="http://schemas.microsoft.com/office/word/2012/wordml" xmlns:w16cex="http://schemas.microsoft.com/office/word/2018/wordml/cex" xmlns:w16cid="http://schemas.microsoft.com/office/word/2016/wordml/cid" xmlns:w16="http://schemas.microsoft.com/office/word/2018/wordml" xmlns:w16se="http://schemas.microsoft.com/office/word/2015/wordml/symex" xmlns:wpg="http://schemas.microsoft.com/office/word/2010/wordprocessingGroup" xmlns:wpi="http://schemas.microsoft.com/office/word/2010/wordprocessingInk" xmlns:wne="http://schemas.microsoft.com/office/word/2006/wordml" xmlns:wps="http://schemas.microsoft.com/office/word/2010/wordprocessingShape" mc:Ignorable="w14 w15 w16se w16cid w16 w16cex wp14">
   <w:footnote w:type="separator" w:id="-1">
     <w:p>
       <w:pPr>
@@ -43702,7 +43741,7 @@
 </file>
 
 <file path=word/header1.xml><?xml version="1.0" encoding="utf-8"?>
-<w:hdr xmlns:wpc="http://schemas.microsoft.com/office/word/2010/wordprocessingCanvas" xmlns:cx="http://schemas.microsoft.com/office/drawing/2014/chartex" xmlns:cx1="http://schemas.microsoft.com/office/drawing/2015/9/8/chartex" xmlns:cx2="http://schemas.microsoft.com/office/drawing/2015/10/21/chartex" xmlns:cx3="http://schemas.microsoft.com/office/drawing/2016/5/9/chartex" xmlns:cx4="http://schemas.microsoft.com/office/drawing/2016/5/10/chartex" xmlns:cx5="http://schemas.microsoft.com/office/drawing/2016/5/11/chartex" xmlns:cx6="http://schemas.microsoft.com/office/drawing/2016/5/12/chartex" xmlns:cx7="http://schemas.microsoft.com/office/drawing/2016/5/13/chartex" xmlns:cx8="http://schemas.microsoft.com/office/drawing/2016/5/14/chartex" xmlns:mc="http://schemas.openxmlformats.org/markup-compatibility/2006" xmlns:aink="http://schemas.microsoft.com/office/drawing/2016/ink" xmlns:am3d="http://schemas.microsoft.com/office/drawing/2017/model3d" xmlns:o="urn:schemas-microsoft-com:office:office" xmlns:r="http://schemas.openxmlformats.org/officeDocument/2006/relationships" xmlns:m="http://schemas.openxmlformats.org/officeDocument/2006/math" xmlns:v="urn:schemas-microsoft-com:vml" xmlns:wp14="http://schemas.microsoft.com/office/word/2010/wordprocessingDrawing" xmlns:wp="http://schemas.openxmlformats.org/drawingml/2006/wordprocessingDrawing" xmlns:w10="urn:schemas-microsoft-com:office:word" xmlns:w="http://schemas.openxmlformats.org/wordprocessingml/2006/main" xmlns:w14="http://schemas.microsoft.com/office/word/2010/wordml" xmlns:w15="http://schemas.microsoft.com/office/word/2012/wordml" xmlns:w16cex="http://schemas.microsoft.com/office/word/2018/wordml/cex" xmlns:w16cid="http://schemas.microsoft.com/office/word/2016/wordml/cid" xmlns:w16="http://schemas.microsoft.com/office/word/2018/wordml" xmlns:w16sdtdh="http://schemas.microsoft.com/office/word/2020/wordml/sdtdatahash" xmlns:w16se="http://schemas.microsoft.com/office/word/2015/wordml/symex" xmlns:wpg="http://schemas.microsoft.com/office/word/2010/wordprocessingGroup" xmlns:wpi="http://schemas.microsoft.com/office/word/2010/wordprocessingInk" xmlns:wne="http://schemas.microsoft.com/office/word/2006/wordml" xmlns:wps="http://schemas.microsoft.com/office/word/2010/wordprocessingShape" mc:Ignorable="w14 w15 w16se w16cid w16 w16cex w16sdtdh wp14">
+<w:hdr xmlns:wpc="http://schemas.microsoft.com/office/word/2010/wordprocessingCanvas" xmlns:cx="http://schemas.microsoft.com/office/drawing/2014/chartex" xmlns:cx1="http://schemas.microsoft.com/office/drawing/2015/9/8/chartex" xmlns:cx2="http://schemas.microsoft.com/office/drawing/2015/10/21/chartex" xmlns:cx3="http://schemas.microsoft.com/office/drawing/2016/5/9/chartex" xmlns:cx4="http://schemas.microsoft.com/office/drawing/2016/5/10/chartex" xmlns:cx5="http://schemas.microsoft.com/office/drawing/2016/5/11/chartex" xmlns:cx6="http://schemas.microsoft.com/office/drawing/2016/5/12/chartex" xmlns:cx7="http://schemas.microsoft.com/office/drawing/2016/5/13/chartex" xmlns:cx8="http://schemas.microsoft.com/office/drawing/2016/5/14/chartex" xmlns:mc="http://schemas.openxmlformats.org/markup-compatibility/2006" xmlns:aink="http://schemas.microsoft.com/office/drawing/2016/ink" xmlns:am3d="http://schemas.microsoft.com/office/drawing/2017/model3d" xmlns:o="urn:schemas-microsoft-com:office:office" xmlns:r="http://schemas.openxmlformats.org/officeDocument/2006/relationships" xmlns:m="http://schemas.openxmlformats.org/officeDocument/2006/math" xmlns:v="urn:schemas-microsoft-com:vml" xmlns:wp14="http://schemas.microsoft.com/office/word/2010/wordprocessingDrawing" xmlns:wp="http://schemas.openxmlformats.org/drawingml/2006/wordprocessingDrawing" xmlns:w10="urn:schemas-microsoft-com:office:word" xmlns:w="http://schemas.openxmlformats.org/wordprocessingml/2006/main" xmlns:w14="http://schemas.microsoft.com/office/word/2010/wordml" xmlns:w15="http://schemas.microsoft.com/office/word/2012/wordml" xmlns:w16cex="http://schemas.microsoft.com/office/word/2018/wordml/cex" xmlns:w16cid="http://schemas.microsoft.com/office/word/2016/wordml/cid" xmlns:w16="http://schemas.microsoft.com/office/word/2018/wordml" xmlns:w16se="http://schemas.microsoft.com/office/word/2015/wordml/symex" xmlns:wpg="http://schemas.microsoft.com/office/word/2010/wordprocessingGroup" xmlns:wpi="http://schemas.microsoft.com/office/word/2010/wordprocessingInk" xmlns:wne="http://schemas.microsoft.com/office/word/2006/wordml" xmlns:wps="http://schemas.microsoft.com/office/word/2010/wordprocessingShape" mc:Ignorable="w14 w15 w16se w16cid w16 w16cex wp14">
   <w:p>
     <w:pPr>
       <w:pStyle w:val="Header"/>
@@ -43718,7 +43757,7 @@
 </file>
 
 <file path=word/header2.xml><?xml version="1.0" encoding="utf-8"?>
-<w:hdr xmlns:wpc="http://schemas.microsoft.com/office/word/2010/wordprocessingCanvas" xmlns:cx="http://schemas.microsoft.com/office/drawing/2014/chartex" xmlns:cx1="http://schemas.microsoft.com/office/drawing/2015/9/8/chartex" xmlns:cx2="http://schemas.microsoft.com/office/drawing/2015/10/21/chartex" xmlns:cx3="http://schemas.microsoft.com/office/drawing/2016/5/9/chartex" xmlns:cx4="http://schemas.microsoft.com/office/drawing/2016/5/10/chartex" xmlns:cx5="http://schemas.microsoft.com/office/drawing/2016/5/11/chartex" xmlns:cx6="http://schemas.microsoft.com/office/drawing/2016/5/12/chartex" xmlns:cx7="http://schemas.microsoft.com/office/drawing/2016/5/13/chartex" xmlns:cx8="http://schemas.microsoft.com/office/drawing/2016/5/14/chartex" xmlns:mc="http://schemas.openxmlformats.org/markup-compatibility/2006" xmlns:aink="http://schemas.microsoft.com/office/drawing/2016/ink" xmlns:am3d="http://schemas.microsoft.com/office/drawing/2017/model3d" xmlns:o="urn:schemas-microsoft-com:office:office" xmlns:r="http://schemas.openxmlformats.org/officeDocument/2006/relationships" xmlns:m="http://schemas.openxmlformats.org/officeDocument/2006/math" xmlns:v="urn:schemas-microsoft-com:vml" xmlns:wp14="http://schemas.microsoft.com/office/word/2010/wordprocessingDrawing" xmlns:wp="http://schemas.openxmlformats.org/drawingml/2006/wordprocessingDrawing" xmlns:w10="urn:schemas-microsoft-com:office:word" xmlns:w="http://schemas.openxmlformats.org/wordprocessingml/2006/main" xmlns:w14="http://schemas.microsoft.com/office/word/2010/wordml" xmlns:w15="http://schemas.microsoft.com/office/word/2012/wordml" xmlns:w16cex="http://schemas.microsoft.com/office/word/2018/wordml/cex" xmlns:w16cid="http://schemas.microsoft.com/office/word/2016/wordml/cid" xmlns:w16="http://schemas.microsoft.com/office/word/2018/wordml" xmlns:w16sdtdh="http://schemas.microsoft.com/office/word/2020/wordml/sdtdatahash" xmlns:w16se="http://schemas.microsoft.com/office/word/2015/wordml/symex" xmlns:wpg="http://schemas.microsoft.com/office/word/2010/wordprocessingGroup" xmlns:wpi="http://schemas.microsoft.com/office/word/2010/wordprocessingInk" xmlns:wne="http://schemas.microsoft.com/office/word/2006/wordml" xmlns:wps="http://schemas.microsoft.com/office/word/2010/wordprocessingShape" mc:Ignorable="w14 w15 w16se w16cid w16 w16cex w16sdtdh wp14">
+<w:hdr xmlns:wpc="http://schemas.microsoft.com/office/word/2010/wordprocessingCanvas" xmlns:cx="http://schemas.microsoft.com/office/drawing/2014/chartex" xmlns:cx1="http://schemas.microsoft.com/office/drawing/2015/9/8/chartex" xmlns:cx2="http://schemas.microsoft.com/office/drawing/2015/10/21/chartex" xmlns:cx3="http://schemas.microsoft.com/office/drawing/2016/5/9/chartex" xmlns:cx4="http://schemas.microsoft.com/office/drawing/2016/5/10/chartex" xmlns:cx5="http://schemas.microsoft.com/office/drawing/2016/5/11/chartex" xmlns:cx6="http://schemas.microsoft.com/office/drawing/2016/5/12/chartex" xmlns:cx7="http://schemas.microsoft.com/office/drawing/2016/5/13/chartex" xmlns:cx8="http://schemas.microsoft.com/office/drawing/2016/5/14/chartex" xmlns:mc="http://schemas.openxmlformats.org/markup-compatibility/2006" xmlns:aink="http://schemas.microsoft.com/office/drawing/2016/ink" xmlns:am3d="http://schemas.microsoft.com/office/drawing/2017/model3d" xmlns:o="urn:schemas-microsoft-com:office:office" xmlns:r="http://schemas.openxmlformats.org/officeDocument/2006/relationships" xmlns:m="http://schemas.openxmlformats.org/officeDocument/2006/math" xmlns:v="urn:schemas-microsoft-com:vml" xmlns:wp14="http://schemas.microsoft.com/office/word/2010/wordprocessingDrawing" xmlns:wp="http://schemas.openxmlformats.org/drawingml/2006/wordprocessingDrawing" xmlns:w10="urn:schemas-microsoft-com:office:word" xmlns:w="http://schemas.openxmlformats.org/wordprocessingml/2006/main" xmlns:w14="http://schemas.microsoft.com/office/word/2010/wordml" xmlns:w15="http://schemas.microsoft.com/office/word/2012/wordml" xmlns:w16cex="http://schemas.microsoft.com/office/word/2018/wordml/cex" xmlns:w16cid="http://schemas.microsoft.com/office/word/2016/wordml/cid" xmlns:w16="http://schemas.microsoft.com/office/word/2018/wordml" xmlns:w16se="http://schemas.microsoft.com/office/word/2015/wordml/symex" xmlns:wpg="http://schemas.microsoft.com/office/word/2010/wordprocessingGroup" xmlns:wpi="http://schemas.microsoft.com/office/word/2010/wordprocessingInk" xmlns:wne="http://schemas.microsoft.com/office/word/2006/wordml" xmlns:wps="http://schemas.microsoft.com/office/word/2010/wordprocessingShape" mc:Ignorable="w14 w15 w16se w16cid w16 w16cex wp14">
   <w:p>
     <w:pPr>
       <w:pStyle w:val="Header"/>
@@ -43734,7 +43773,7 @@
 </file>
 
 <file path=word/numbering.xml><?xml version="1.0" encoding="utf-8"?>
-<w:numbering xmlns:wpc="http://schemas.microsoft.com/office/word/2010/wordprocessingCanvas" xmlns:cx="http://schemas.microsoft.com/office/drawing/2014/chartex" xmlns:cx1="http://schemas.microsoft.com/office/drawing/2015/9/8/chartex" xmlns:cx2="http://schemas.microsoft.com/office/drawing/2015/10/21/chartex" xmlns:cx3="http://schemas.microsoft.com/office/drawing/2016/5/9/chartex" xmlns:cx4="http://schemas.microsoft.com/office/drawing/2016/5/10/chartex" xmlns:cx5="http://schemas.microsoft.com/office/drawing/2016/5/11/chartex" xmlns:cx6="http://schemas.microsoft.com/office/drawing/2016/5/12/chartex" xmlns:cx7="http://schemas.microsoft.com/office/drawing/2016/5/13/chartex" xmlns:cx8="http://schemas.microsoft.com/office/drawing/2016/5/14/chartex" xmlns:mc="http://schemas.openxmlformats.org/markup-compatibility/2006" xmlns:aink="http://schemas.microsoft.com/office/drawing/2016/ink" xmlns:am3d="http://schemas.microsoft.com/office/drawing/2017/model3d" xmlns:o="urn:schemas-microsoft-com:office:office" xmlns:r="http://schemas.openxmlformats.org/officeDocument/2006/relationships" xmlns:m="http://schemas.openxmlformats.org/officeDocument/2006/math" xmlns:v="urn:schemas-microsoft-com:vml" xmlns:wp14="http://schemas.microsoft.com/office/word/2010/wordprocessingDrawing" xmlns:wp="http://schemas.openxmlformats.org/drawingml/2006/wordprocessingDrawing" xmlns:w10="urn:schemas-microsoft-com:office:word" xmlns:w="http://schemas.openxmlformats.org/wordprocessingml/2006/main" xmlns:w14="http://schemas.microsoft.com/office/word/2010/wordml" xmlns:w15="http://schemas.microsoft.com/office/word/2012/wordml" xmlns:w16cex="http://schemas.microsoft.com/office/word/2018/wordml/cex" xmlns:w16cid="http://schemas.microsoft.com/office/word/2016/wordml/cid" xmlns:w16="http://schemas.microsoft.com/office/word/2018/wordml" xmlns:w16sdtdh="http://schemas.microsoft.com/office/word/2020/wordml/sdtdatahash" xmlns:w16se="http://schemas.microsoft.com/office/word/2015/wordml/symex" xmlns:wpg="http://schemas.microsoft.com/office/word/2010/wordprocessingGroup" xmlns:wpi="http://schemas.microsoft.com/office/word/2010/wordprocessingInk" xmlns:wne="http://schemas.microsoft.com/office/word/2006/wordml" xmlns:wps="http://schemas.microsoft.com/office/word/2010/wordprocessingShape" mc:Ignorable="w14 w15 w16se w16cid w16 w16cex w16sdtdh wp14">
+<w:numbering xmlns:wpc="http://schemas.microsoft.com/office/word/2010/wordprocessingCanvas" xmlns:cx="http://schemas.microsoft.com/office/drawing/2014/chartex" xmlns:cx1="http://schemas.microsoft.com/office/drawing/2015/9/8/chartex" xmlns:cx2="http://schemas.microsoft.com/office/drawing/2015/10/21/chartex" xmlns:cx3="http://schemas.microsoft.com/office/drawing/2016/5/9/chartex" xmlns:cx4="http://schemas.microsoft.com/office/drawing/2016/5/10/chartex" xmlns:cx5="http://schemas.microsoft.com/office/drawing/2016/5/11/chartex" xmlns:cx6="http://schemas.microsoft.com/office/drawing/2016/5/12/chartex" xmlns:cx7="http://schemas.microsoft.com/office/drawing/2016/5/13/chartex" xmlns:cx8="http://schemas.microsoft.com/office/drawing/2016/5/14/chartex" xmlns:mc="http://schemas.openxmlformats.org/markup-compatibility/2006" xmlns:aink="http://schemas.microsoft.com/office/drawing/2016/ink" xmlns:am3d="http://schemas.microsoft.com/office/drawing/2017/model3d" xmlns:o="urn:schemas-microsoft-com:office:office" xmlns:r="http://schemas.openxmlformats.org/officeDocument/2006/relationships" xmlns:m="http://schemas.openxmlformats.org/officeDocument/2006/math" xmlns:v="urn:schemas-microsoft-com:vml" xmlns:wp14="http://schemas.microsoft.com/office/word/2010/wordprocessingDrawing" xmlns:wp="http://schemas.openxmlformats.org/drawingml/2006/wordprocessingDrawing" xmlns:w10="urn:schemas-microsoft-com:office:word" xmlns:w="http://schemas.openxmlformats.org/wordprocessingml/2006/main" xmlns:w14="http://schemas.microsoft.com/office/word/2010/wordml" xmlns:w15="http://schemas.microsoft.com/office/word/2012/wordml" xmlns:w16cex="http://schemas.microsoft.com/office/word/2018/wordml/cex" xmlns:w16cid="http://schemas.microsoft.com/office/word/2016/wordml/cid" xmlns:w16="http://schemas.microsoft.com/office/word/2018/wordml" xmlns:w16se="http://schemas.microsoft.com/office/word/2015/wordml/symex" xmlns:wpg="http://schemas.microsoft.com/office/word/2010/wordprocessingGroup" xmlns:wpi="http://schemas.microsoft.com/office/word/2010/wordprocessingInk" xmlns:wne="http://schemas.microsoft.com/office/word/2006/wordml" xmlns:wps="http://schemas.microsoft.com/office/word/2010/wordprocessingShape" mc:Ignorable="w14 w15 w16se w16cid w16 w16cex wp14">
   <w:abstractNum w:abstractNumId="0" w15:restartNumberingAfterBreak="0">
     <w:nsid w:val="10874337"/>
     <w:multiLevelType w:val="hybridMultilevel"/>
@@ -45833,7 +45872,7 @@
 </file>
 
 <file path=word/styles.xml><?xml version="1.0" encoding="utf-8"?>
-<w:styles xmlns:mc="http://schemas.openxmlformats.org/markup-compatibility/2006" xmlns:r="http://schemas.openxmlformats.org/officeDocument/2006/relationships" xmlns:w="http://schemas.openxmlformats.org/wordprocessingml/2006/main" xmlns:w14="http://schemas.microsoft.com/office/word/2010/wordml" xmlns:w15="http://schemas.microsoft.com/office/word/2012/wordml" xmlns:w16cex="http://schemas.microsoft.com/office/word/2018/wordml/cex" xmlns:w16cid="http://schemas.microsoft.com/office/word/2016/wordml/cid" xmlns:w16="http://schemas.microsoft.com/office/word/2018/wordml" xmlns:w16sdtdh="http://schemas.microsoft.com/office/word/2020/wordml/sdtdatahash" xmlns:w16se="http://schemas.microsoft.com/office/word/2015/wordml/symex" mc:Ignorable="w14 w15 w16se w16cid w16 w16cex w16sdtdh">
+<w:styles xmlns:mc="http://schemas.openxmlformats.org/markup-compatibility/2006" xmlns:r="http://schemas.openxmlformats.org/officeDocument/2006/relationships" xmlns:w="http://schemas.openxmlformats.org/wordprocessingml/2006/main" xmlns:w14="http://schemas.microsoft.com/office/word/2010/wordml" xmlns:w15="http://schemas.microsoft.com/office/word/2012/wordml" xmlns:w16cex="http://schemas.microsoft.com/office/word/2018/wordml/cex" xmlns:w16cid="http://schemas.microsoft.com/office/word/2016/wordml/cid" xmlns:w16="http://schemas.microsoft.com/office/word/2018/wordml" xmlns:w16se="http://schemas.microsoft.com/office/word/2015/wordml/symex" mc:Ignorable="w14 w15 w16se w16cid w16 w16cex">
   <w:docDefaults>
     <w:rPrDefault>
       <w:rPr>

</xml_diff>